<commit_message>
Move learning diary from cloud to github
</commit_message>
<xml_diff>
--- a/Principle of Project Management Learning Diary.docx
+++ b/Principle of Project Management Learning Diary.docx
@@ -2,6 +2,955 @@
 <file path=word/document.xml><?xml version="1.0" encoding="utf-8"?>
 <w:document xmlns:wpc="http://schemas.microsoft.com/office/word/2010/wordprocessingCanvas" xmlns:cx="http://schemas.microsoft.com/office/drawing/2014/chartex" xmlns:cx1="http://schemas.microsoft.com/office/drawing/2015/9/8/chartex" xmlns:cx2="http://schemas.microsoft.com/office/drawing/2015/10/21/chartex" xmlns:cx3="http://schemas.microsoft.com/office/drawing/2016/5/9/chartex" xmlns:cx4="http://schemas.microsoft.com/office/drawing/2016/5/10/chartex" xmlns:cx5="http://schemas.microsoft.com/office/drawing/2016/5/11/chartex" xmlns:cx6="http://schemas.microsoft.com/office/drawing/2016/5/12/chartex" xmlns:cx7="http://schemas.microsoft.com/office/drawing/2016/5/13/chartex" xmlns:cx8="http://schemas.microsoft.com/office/drawing/2016/5/14/chartex" xmlns:mc="http://schemas.openxmlformats.org/markup-compatibility/2006" xmlns:aink="http://schemas.microsoft.com/office/drawing/2016/ink" xmlns:am3d="http://schemas.microsoft.com/office/drawing/2017/model3d" xmlns:o="urn:schemas-microsoft-com:office:office" xmlns:oel="http://schemas.microsoft.com/office/2019/extlst" xmlns:r="http://schemas.openxmlformats.org/officeDocument/2006/relationships" xmlns:m="http://schemas.openxmlformats.org/officeDocument/2006/math" xmlns:v="urn:schemas-microsoft-com:vml" xmlns:wp14="http://schemas.microsoft.com/office/word/2010/wordprocessingDrawing" xmlns:wp="http://schemas.openxmlformats.org/drawingml/2006/wordprocessingDrawing" xmlns:w10="urn:schemas-microsoft-com:office:word" xmlns:w="http://schemas.openxmlformats.org/wordprocessingml/2006/main" xmlns:w14="http://schemas.microsoft.com/office/word/2010/wordml" xmlns:w15="http://schemas.microsoft.com/office/word/2012/wordml" xmlns:w16cex="http://schemas.microsoft.com/office/word/2018/wordml/cex" xmlns:w16cid="http://schemas.microsoft.com/office/word/2016/wordml/cid" xmlns:w16="http://schemas.microsoft.com/office/word/2018/wordml" xmlns:w16du="http://schemas.microsoft.com/office/word/2023/wordml/word16du" xmlns:w16sdtdh="http://schemas.microsoft.com/office/word/2020/wordml/sdtdatahash" xmlns:w16sdtfl="http://schemas.microsoft.com/office/word/2024/wordml/sdtformatlock" xmlns:w16se="http://schemas.microsoft.com/office/word/2015/wordml/symex" xmlns:wpg="http://schemas.microsoft.com/office/word/2010/wordprocessingGroup" xmlns:wpi="http://schemas.microsoft.com/office/word/2010/wordprocessingInk" xmlns:wne="http://schemas.microsoft.com/office/word/2006/wordml" xmlns:wps="http://schemas.microsoft.com/office/word/2010/wordprocessingShape" mc:Ignorable="w14 w15 w16se w16cid w16 w16cex w16sdtdh w16sdtfl w16du wp14">
   <w:body>
+    <w:p>
+      <w:pPr>
+        <w:rPr>
+          <w:b/>
+          <w:bCs/>
+        </w:rPr>
+      </w:pPr>
+      <w:r>
+        <w:rPr>
+          <w:b/>
+          <w:bCs/>
+        </w:rPr>
+        <w:t>Date: 07/09/2026</w:t>
+      </w:r>
+    </w:p>
+    <w:p>
+      <w:pPr>
+        <w:rPr>
+          <w:b/>
+          <w:bCs/>
+        </w:rPr>
+      </w:pPr>
+      <w:r>
+        <w:rPr>
+          <w:b/>
+          <w:bCs/>
+        </w:rPr>
+        <w:t xml:space="preserve">- </w:t>
+      </w:r>
+      <w:r>
+        <w:t>Discussing the meeting time with the team</w:t>
+      </w:r>
+    </w:p>
+    <w:p>
+      <w:r>
+        <w:t>- Do small tasks using AI support: Imagine you are a project manager and think about a task where you could use AI. Choose one aspect, role, or concept of project management. Decide on this yourself. Initiate the discussion by adding your post here, in which you have first asked AI for assistance (e.g., from ChatGPT) and added your comments</w:t>
+      </w:r>
+    </w:p>
+    <w:p>
+      <w:r>
+        <w:t>- Questions and answer the team's questions about the assignment from the Project Management and R&amp;D class</w:t>
+      </w:r>
+    </w:p>
+    <w:p>
+      <w:pPr>
+        <w:rPr>
+          <w:b/>
+          <w:bCs/>
+        </w:rPr>
+      </w:pPr>
+      <w:r>
+        <w:rPr>
+          <w:b/>
+          <w:bCs/>
+        </w:rPr>
+        <w:t>Date 08/09/2026</w:t>
+      </w:r>
+    </w:p>
+    <w:p>
+      <w:r>
+        <w:t>- Discussing with the team to pick the Project management topic</w:t>
+      </w:r>
+    </w:p>
+    <w:p>
+      <w:r>
+        <w:t>- Join the Intelligence Cloud Applications class</w:t>
+      </w:r>
+    </w:p>
+    <w:p>
+      <w:r>
+        <w:t>- Implementing a side project</w:t>
+      </w:r>
+    </w:p>
+    <w:p>
+      <w:r>
+        <w:t>- Reply comment on forum</w:t>
+      </w:r>
+    </w:p>
+    <w:p>
+      <w:pPr>
+        <w:rPr>
+          <w:b/>
+          <w:bCs/>
+        </w:rPr>
+      </w:pPr>
+      <w:r>
+        <w:rPr>
+          <w:b/>
+          <w:bCs/>
+        </w:rPr>
+        <w:t xml:space="preserve">Date </w:t>
+      </w:r>
+      <w:r>
+        <w:rPr>
+          <w:b/>
+          <w:bCs/>
+        </w:rPr>
+        <w:t>10</w:t>
+      </w:r>
+      <w:r>
+        <w:rPr>
+          <w:b/>
+          <w:bCs/>
+        </w:rPr>
+        <w:t>/09/2026</w:t>
+      </w:r>
+    </w:p>
+    <w:p>
+      <w:r>
+        <w:t>- Draw the architecture of the simulated application in the Intelligence Cloud Application course</w:t>
+      </w:r>
+    </w:p>
+    <w:p>
+      <w:r>
+        <w:t xml:space="preserve">- Discuss with </w:t>
+      </w:r>
+      <w:proofErr w:type="spellStart"/>
+      <w:r>
+        <w:t>teammember</w:t>
+      </w:r>
+      <w:proofErr w:type="spellEnd"/>
+      <w:r>
+        <w:t xml:space="preserve"> about the architecture flow</w:t>
+      </w:r>
+    </w:p>
+    <w:p>
+      <w:r>
+        <w:t>- Research question 3 in the project management course</w:t>
+      </w:r>
+    </w:p>
+    <w:p>
+      <w:pPr>
+        <w:rPr>
+          <w:b/>
+          <w:bCs/>
+        </w:rPr>
+      </w:pPr>
+      <w:r>
+        <w:rPr>
+          <w:b/>
+          <w:bCs/>
+        </w:rPr>
+        <w:t xml:space="preserve">Date </w:t>
+      </w:r>
+      <w:r>
+        <w:rPr>
+          <w:b/>
+          <w:bCs/>
+        </w:rPr>
+        <w:t>11</w:t>
+      </w:r>
+      <w:r>
+        <w:rPr>
+          <w:b/>
+          <w:bCs/>
+        </w:rPr>
+        <w:t>/09/2026</w:t>
+      </w:r>
+    </w:p>
+    <w:p>
+      <w:r>
+        <w:t>- Read the PM course booking</w:t>
+      </w:r>
+    </w:p>
+    <w:p>
+      <w:r>
+        <w:t>- Do the Module 1: Quiz</w:t>
+      </w:r>
+    </w:p>
+    <w:p>
+      <w:pPr>
+        <w:rPr>
+          <w:b/>
+          <w:bCs/>
+        </w:rPr>
+      </w:pPr>
+      <w:r>
+        <w:rPr>
+          <w:b/>
+          <w:bCs/>
+        </w:rPr>
+        <w:t xml:space="preserve">Date </w:t>
+      </w:r>
+      <w:r>
+        <w:rPr>
+          <w:b/>
+          <w:bCs/>
+        </w:rPr>
+        <w:t>12</w:t>
+      </w:r>
+      <w:r>
+        <w:rPr>
+          <w:b/>
+          <w:bCs/>
+        </w:rPr>
+        <w:t>/09/2026</w:t>
+      </w:r>
+    </w:p>
+    <w:p>
+      <w:r>
+        <w:t>- Joining Language guidance for thesis writing class</w:t>
+      </w:r>
+    </w:p>
+    <w:p>
+      <w:r>
+        <w:t>- Do the quizzes</w:t>
+      </w:r>
+    </w:p>
+    <w:p>
+      <w:pPr>
+        <w:rPr>
+          <w:b/>
+          <w:bCs/>
+        </w:rPr>
+      </w:pPr>
+      <w:r>
+        <w:rPr>
+          <w:b/>
+          <w:bCs/>
+        </w:rPr>
+        <w:t xml:space="preserve">Date </w:t>
+      </w:r>
+      <w:r>
+        <w:rPr>
+          <w:b/>
+          <w:bCs/>
+        </w:rPr>
+        <w:t>13</w:t>
+      </w:r>
+      <w:r>
+        <w:rPr>
+          <w:b/>
+          <w:bCs/>
+        </w:rPr>
+        <w:t>/09/2026</w:t>
+      </w:r>
+    </w:p>
+    <w:p>
+      <w:r>
+        <w:t xml:space="preserve">- Read article reference links in the Intelligence Cloud Software </w:t>
+      </w:r>
+      <w:proofErr w:type="spellStart"/>
+      <w:r>
+        <w:t>couse</w:t>
+      </w:r>
+      <w:proofErr w:type="spellEnd"/>
+    </w:p>
+    <w:p>
+      <w:r>
+        <w:t xml:space="preserve">- Prepare the second </w:t>
+      </w:r>
+      <w:proofErr w:type="spellStart"/>
+      <w:r>
+        <w:t>dỉagram</w:t>
+      </w:r>
+      <w:proofErr w:type="spellEnd"/>
+      <w:r>
+        <w:t xml:space="preserve"> follow serverless architect</w:t>
+      </w:r>
+    </w:p>
+    <w:p>
+      <w:pPr>
+        <w:rPr>
+          <w:b/>
+          <w:bCs/>
+        </w:rPr>
+      </w:pPr>
+      <w:r>
+        <w:rPr>
+          <w:b/>
+          <w:bCs/>
+        </w:rPr>
+        <w:t xml:space="preserve">Date </w:t>
+      </w:r>
+      <w:r>
+        <w:rPr>
+          <w:b/>
+          <w:bCs/>
+        </w:rPr>
+        <w:t>15</w:t>
+      </w:r>
+      <w:r>
+        <w:rPr>
+          <w:b/>
+          <w:bCs/>
+        </w:rPr>
+        <w:t>/09/2026</w:t>
+      </w:r>
+    </w:p>
+    <w:p>
+      <w:r>
+        <w:lastRenderedPageBreak/>
+        <w:t>- Read the intelligence could application course book and do the assignment</w:t>
+      </w:r>
+      <w:r>
+        <w:br/>
+        <w:t>- Joining intelligence could application class</w:t>
+      </w:r>
+    </w:p>
+    <w:p>
+      <w:pPr>
+        <w:rPr>
+          <w:b/>
+          <w:bCs/>
+        </w:rPr>
+      </w:pPr>
+      <w:r>
+        <w:rPr>
+          <w:b/>
+          <w:bCs/>
+        </w:rPr>
+        <w:t xml:space="preserve">Date </w:t>
+      </w:r>
+      <w:r>
+        <w:rPr>
+          <w:b/>
+          <w:bCs/>
+        </w:rPr>
+        <w:t>16</w:t>
+      </w:r>
+      <w:r>
+        <w:rPr>
+          <w:b/>
+          <w:bCs/>
+        </w:rPr>
+        <w:t>/09/2026</w:t>
+      </w:r>
+    </w:p>
+    <w:p>
+      <w:r>
+        <w:t xml:space="preserve">- Preparing CV and research company in Matching </w:t>
+      </w:r>
+      <w:proofErr w:type="spellStart"/>
+      <w:r>
+        <w:t>Techbothonia</w:t>
+      </w:r>
+      <w:proofErr w:type="spellEnd"/>
+      <w:r>
+        <w:t xml:space="preserve"> to find available position or thesis topic</w:t>
+      </w:r>
+    </w:p>
+    <w:p>
+      <w:pPr>
+        <w:rPr>
+          <w:b/>
+          <w:bCs/>
+        </w:rPr>
+      </w:pPr>
+      <w:r>
+        <w:rPr>
+          <w:b/>
+          <w:bCs/>
+        </w:rPr>
+        <w:t xml:space="preserve">Date </w:t>
+      </w:r>
+      <w:r>
+        <w:rPr>
+          <w:b/>
+          <w:bCs/>
+        </w:rPr>
+        <w:t>17</w:t>
+      </w:r>
+      <w:r>
+        <w:rPr>
+          <w:b/>
+          <w:bCs/>
+        </w:rPr>
+        <w:t>/09/2026</w:t>
+      </w:r>
+    </w:p>
+    <w:p>
+      <w:r>
+        <w:t>- Joining matching event and asking company in that event about thesis topic and available positions as well but no matching found</w:t>
+      </w:r>
+    </w:p>
+    <w:p>
+      <w:pPr>
+        <w:rPr>
+          <w:b/>
+          <w:bCs/>
+        </w:rPr>
+      </w:pPr>
+      <w:r>
+        <w:rPr>
+          <w:b/>
+          <w:bCs/>
+        </w:rPr>
+        <w:t xml:space="preserve">Date </w:t>
+      </w:r>
+      <w:r>
+        <w:rPr>
+          <w:b/>
+          <w:bCs/>
+        </w:rPr>
+        <w:t>1</w:t>
+      </w:r>
+      <w:r>
+        <w:rPr>
+          <w:b/>
+          <w:bCs/>
+        </w:rPr>
+        <w:t>8/09/2026</w:t>
+      </w:r>
+    </w:p>
+    <w:p>
+      <w:r>
+        <w:t>- Reading book: Doing Case Study Research</w:t>
+      </w:r>
+    </w:p>
+    <w:p>
+      <w:r>
+        <w:t>- Finish task 1 in Research and Development method class</w:t>
+      </w:r>
+    </w:p>
+    <w:p>
+      <w:pPr>
+        <w:rPr>
+          <w:b/>
+          <w:bCs/>
+        </w:rPr>
+      </w:pPr>
+      <w:r>
+        <w:rPr>
+          <w:b/>
+          <w:bCs/>
+        </w:rPr>
+        <w:t xml:space="preserve">Date </w:t>
+      </w:r>
+      <w:r>
+        <w:rPr>
+          <w:b/>
+          <w:bCs/>
+        </w:rPr>
+        <w:t>19</w:t>
+      </w:r>
+      <w:r>
+        <w:rPr>
+          <w:b/>
+          <w:bCs/>
+        </w:rPr>
+        <w:t>/09/2026</w:t>
+      </w:r>
+    </w:p>
+    <w:p>
+      <w:r>
+        <w:t xml:space="preserve">   - Joining Principles of Project Management and do the in class </w:t>
+      </w:r>
+      <w:proofErr w:type="spellStart"/>
+      <w:r>
+        <w:t>assingment</w:t>
+      </w:r>
+      <w:proofErr w:type="spellEnd"/>
+      <w:r>
+        <w:t xml:space="preserve"> with team</w:t>
+      </w:r>
+    </w:p>
+    <w:p>
+      <w:pPr>
+        <w:rPr>
+          <w:b/>
+          <w:bCs/>
+        </w:rPr>
+      </w:pPr>
+      <w:r>
+        <w:rPr>
+          <w:b/>
+          <w:bCs/>
+        </w:rPr>
+        <w:t xml:space="preserve">Date </w:t>
+      </w:r>
+      <w:r>
+        <w:rPr>
+          <w:b/>
+          <w:bCs/>
+        </w:rPr>
+        <w:t>21</w:t>
+      </w:r>
+      <w:r>
+        <w:rPr>
+          <w:b/>
+          <w:bCs/>
+        </w:rPr>
+        <w:t>/09/2026</w:t>
+      </w:r>
+    </w:p>
+    <w:p>
+      <w:r>
+        <w:t>- Reading some articles to complete the intelligence cloud application class assignment:</w:t>
+      </w:r>
+    </w:p>
+    <w:p>
+      <w:r>
+        <w:t>https://www.redhat.com/en/topics/cloud-native-apps/stateful-vs-stateless</w:t>
+      </w:r>
+    </w:p>
+    <w:p>
+      <w:r>
+        <w:t>https://www.researchgate.net/publication/391385938_Cloud-native_transformation_Architectural_principles_and_organizational_strategies_for_infrastructure_modernization</w:t>
+      </w:r>
+    </w:p>
+    <w:p>
+      <w:r>
+        <w:t>https://intercept.cloud/en-gb/blogs/what-is-cloud-native-architecture</w:t>
+      </w:r>
+    </w:p>
+    <w:p>
+      <w:pPr>
+        <w:rPr>
+          <w:b/>
+          <w:bCs/>
+        </w:rPr>
+      </w:pPr>
+      <w:r>
+        <w:rPr>
+          <w:b/>
+          <w:bCs/>
+        </w:rPr>
+        <w:t xml:space="preserve">Date </w:t>
+      </w:r>
+      <w:r>
+        <w:rPr>
+          <w:b/>
+          <w:bCs/>
+        </w:rPr>
+        <w:t>22</w:t>
+      </w:r>
+      <w:r>
+        <w:rPr>
+          <w:b/>
+          <w:bCs/>
+        </w:rPr>
+        <w:t>/09/2026</w:t>
+      </w:r>
+    </w:p>
+    <w:p>
+      <w:r>
+        <w:t>- Joining the Intelligence Cloud Application in class</w:t>
+      </w:r>
+    </w:p>
+    <w:p>
+      <w:r>
+        <w:t>- Getting insights and experience sharing from Mr. Johan</w:t>
+      </w:r>
+    </w:p>
+    <w:p>
+      <w:r>
+        <w:t>- Init the project event booking based on previous company architecture</w:t>
+      </w:r>
+    </w:p>
+    <w:p>
+      <w:pPr>
+        <w:rPr>
+          <w:b/>
+          <w:bCs/>
+        </w:rPr>
+      </w:pPr>
+      <w:r>
+        <w:rPr>
+          <w:b/>
+          <w:bCs/>
+        </w:rPr>
+        <w:t xml:space="preserve">Date </w:t>
+      </w:r>
+      <w:r>
+        <w:rPr>
+          <w:b/>
+          <w:bCs/>
+        </w:rPr>
+        <w:t>23</w:t>
+      </w:r>
+      <w:r>
+        <w:rPr>
+          <w:b/>
+          <w:bCs/>
+        </w:rPr>
+        <w:t>/09/2026</w:t>
+      </w:r>
+    </w:p>
+    <w:p>
+      <w:r>
+        <w:t>- Publish the event booking repositories</w:t>
+      </w:r>
+    </w:p>
+    <w:p>
+      <w:r>
+        <w:t xml:space="preserve">- Research some technical: Kafka, </w:t>
+      </w:r>
+      <w:proofErr w:type="spellStart"/>
+      <w:r>
+        <w:t>Orkes</w:t>
+      </w:r>
+      <w:proofErr w:type="spellEnd"/>
+    </w:p>
+    <w:p>
+      <w:pPr>
+        <w:rPr>
+          <w:b/>
+          <w:bCs/>
+        </w:rPr>
+      </w:pPr>
+      <w:r>
+        <w:rPr>
+          <w:b/>
+          <w:bCs/>
+        </w:rPr>
+        <w:lastRenderedPageBreak/>
+        <w:t xml:space="preserve">Date </w:t>
+      </w:r>
+      <w:r>
+        <w:rPr>
+          <w:b/>
+          <w:bCs/>
+        </w:rPr>
+        <w:t>2</w:t>
+      </w:r>
+      <w:r>
+        <w:rPr>
+          <w:b/>
+          <w:bCs/>
+        </w:rPr>
+        <w:t>4</w:t>
+      </w:r>
+      <w:r>
+        <w:rPr>
+          <w:b/>
+          <w:bCs/>
+        </w:rPr>
+        <w:t>/09/2026</w:t>
+      </w:r>
+    </w:p>
+    <w:p>
+      <w:r>
+        <w:t xml:space="preserve">- Joining the Intelligence Cloud Application class and take the class </w:t>
+      </w:r>
+      <w:r>
+        <w:t>assignment</w:t>
+      </w:r>
+    </w:p>
+    <w:p>
+      <w:pPr>
+        <w:rPr>
+          <w:b/>
+          <w:bCs/>
+        </w:rPr>
+      </w:pPr>
+      <w:r>
+        <w:rPr>
+          <w:b/>
+          <w:bCs/>
+        </w:rPr>
+        <w:t xml:space="preserve">Date </w:t>
+      </w:r>
+      <w:r>
+        <w:rPr>
+          <w:b/>
+          <w:bCs/>
+        </w:rPr>
+        <w:t>2</w:t>
+      </w:r>
+      <w:r>
+        <w:rPr>
+          <w:b/>
+          <w:bCs/>
+        </w:rPr>
+        <w:t>5</w:t>
+      </w:r>
+      <w:r>
+        <w:rPr>
+          <w:b/>
+          <w:bCs/>
+        </w:rPr>
+        <w:t>/09/2026</w:t>
+      </w:r>
+    </w:p>
+    <w:p>
+      <w:r>
+        <w:t>- Connect LinkedIn HR to reaching the job</w:t>
+      </w:r>
+    </w:p>
+    <w:p>
+      <w:r>
+        <w:t>- Answer the missing question 4 in Task 1  R&amp;D class</w:t>
+      </w:r>
+    </w:p>
+    <w:p>
+      <w:pPr>
+        <w:rPr>
+          <w:b/>
+          <w:bCs/>
+        </w:rPr>
+      </w:pPr>
+      <w:r>
+        <w:rPr>
+          <w:b/>
+          <w:bCs/>
+        </w:rPr>
+        <w:t xml:space="preserve">Date </w:t>
+      </w:r>
+      <w:r>
+        <w:rPr>
+          <w:b/>
+          <w:bCs/>
+        </w:rPr>
+        <w:t>2</w:t>
+      </w:r>
+      <w:r>
+        <w:rPr>
+          <w:b/>
+          <w:bCs/>
+        </w:rPr>
+        <w:t>6</w:t>
+      </w:r>
+      <w:r>
+        <w:rPr>
+          <w:b/>
+          <w:bCs/>
+        </w:rPr>
+        <w:t>/09/2026</w:t>
+      </w:r>
+    </w:p>
+    <w:p>
+      <w:r>
+        <w:t>- Joining R&amp;D class</w:t>
+      </w:r>
+    </w:p>
+    <w:p>
+      <w:r>
+        <w:t>- Doing a class assignment with group in class</w:t>
+      </w:r>
+    </w:p>
+    <w:p>
+      <w:pPr>
+        <w:rPr>
+          <w:b/>
+          <w:bCs/>
+        </w:rPr>
+      </w:pPr>
+    </w:p>
+    <w:p>
+      <w:pPr>
+        <w:rPr>
+          <w:b/>
+          <w:bCs/>
+        </w:rPr>
+      </w:pPr>
+      <w:r>
+        <w:rPr>
+          <w:b/>
+          <w:bCs/>
+        </w:rPr>
+        <w:t xml:space="preserve">Date </w:t>
+      </w:r>
+      <w:r>
+        <w:rPr>
+          <w:b/>
+          <w:bCs/>
+        </w:rPr>
+        <w:t>24</w:t>
+      </w:r>
+      <w:r>
+        <w:rPr>
+          <w:b/>
+          <w:bCs/>
+        </w:rPr>
+        <w:t>/09/2026</w:t>
+      </w:r>
+    </w:p>
+    <w:p>
+      <w:pPr>
+        <w:rPr>
+          <w:b/>
+          <w:bCs/>
+        </w:rPr>
+      </w:pPr>
+      <w:r>
+        <w:rPr>
+          <w:b/>
+          <w:bCs/>
+        </w:rPr>
+        <w:t xml:space="preserve">Date </w:t>
+      </w:r>
+      <w:r>
+        <w:rPr>
+          <w:b/>
+          <w:bCs/>
+        </w:rPr>
+        <w:t>24</w:t>
+      </w:r>
+      <w:r>
+        <w:rPr>
+          <w:b/>
+          <w:bCs/>
+        </w:rPr>
+        <w:t>/09/2026</w:t>
+      </w:r>
+    </w:p>
+    <w:p>
+      <w:pPr>
+        <w:rPr>
+          <w:b/>
+          <w:bCs/>
+        </w:rPr>
+      </w:pPr>
+      <w:r>
+        <w:rPr>
+          <w:b/>
+          <w:bCs/>
+        </w:rPr>
+        <w:t xml:space="preserve">Date </w:t>
+      </w:r>
+      <w:r>
+        <w:rPr>
+          <w:b/>
+          <w:bCs/>
+        </w:rPr>
+        <w:t>24</w:t>
+      </w:r>
+      <w:r>
+        <w:rPr>
+          <w:b/>
+          <w:bCs/>
+        </w:rPr>
+        <w:t>/09/2026</w:t>
+      </w:r>
+    </w:p>
+    <w:p>
+      <w:pPr>
+        <w:rPr>
+          <w:b/>
+          <w:bCs/>
+        </w:rPr>
+      </w:pPr>
+      <w:r>
+        <w:rPr>
+          <w:b/>
+          <w:bCs/>
+        </w:rPr>
+        <w:t xml:space="preserve">Date </w:t>
+      </w:r>
+      <w:r>
+        <w:rPr>
+          <w:b/>
+          <w:bCs/>
+        </w:rPr>
+        <w:t>24</w:t>
+      </w:r>
+      <w:r>
+        <w:rPr>
+          <w:b/>
+          <w:bCs/>
+        </w:rPr>
+        <w:t>/09/2026</w:t>
+      </w:r>
+    </w:p>
+    <w:p>
+      <w:pPr>
+        <w:rPr>
+          <w:b/>
+          <w:bCs/>
+        </w:rPr>
+      </w:pPr>
+      <w:r>
+        <w:rPr>
+          <w:b/>
+          <w:bCs/>
+        </w:rPr>
+        <w:t xml:space="preserve">Date </w:t>
+      </w:r>
+      <w:r>
+        <w:rPr>
+          <w:b/>
+          <w:bCs/>
+        </w:rPr>
+        <w:t>24</w:t>
+      </w:r>
+      <w:r>
+        <w:rPr>
+          <w:b/>
+          <w:bCs/>
+        </w:rPr>
+        <w:t>/09/2026</w:t>
+      </w:r>
+    </w:p>
+    <w:p>
+      <w:pPr>
+        <w:rPr>
+          <w:b/>
+          <w:bCs/>
+        </w:rPr>
+      </w:pPr>
+      <w:r>
+        <w:rPr>
+          <w:b/>
+          <w:bCs/>
+        </w:rPr>
+        <w:t xml:space="preserve">Date </w:t>
+      </w:r>
+      <w:r>
+        <w:rPr>
+          <w:b/>
+          <w:bCs/>
+        </w:rPr>
+        <w:t>24</w:t>
+      </w:r>
+      <w:r>
+        <w:rPr>
+          <w:b/>
+          <w:bCs/>
+        </w:rPr>
+        <w:t>/09/2026</w:t>
+      </w:r>
+    </w:p>
+    <w:p>
+      <w:pPr>
+        <w:rPr>
+          <w:b/>
+          <w:bCs/>
+        </w:rPr>
+      </w:pPr>
+      <w:r>
+        <w:rPr>
+          <w:b/>
+          <w:bCs/>
+        </w:rPr>
+        <w:t xml:space="preserve">Date </w:t>
+      </w:r>
+      <w:r>
+        <w:rPr>
+          <w:b/>
+          <w:bCs/>
+        </w:rPr>
+        <w:t>24</w:t>
+      </w:r>
+      <w:r>
+        <w:rPr>
+          <w:b/>
+          <w:bCs/>
+        </w:rPr>
+        <w:t>/09/2026</w:t>
+      </w:r>
+    </w:p>
+    <w:p>
+      <w:pPr>
+        <w:rPr>
+          <w:b/>
+          <w:bCs/>
+        </w:rPr>
+      </w:pPr>
+    </w:p>
     <w:p/>
     <w:sectPr>
       <w:pgSz w:w="12240" w:h="15840"/>
@@ -413,6 +1362,7 @@
   <w:style w:type="paragraph" w:default="1" w:styleId="Normal">
     <w:name w:val="Normal"/>
     <w:qFormat/>
+    <w:rsid w:val="000D4957"/>
   </w:style>
   <w:style w:type="paragraph" w:styleId="Heading1">
     <w:name w:val="heading 1"/>
@@ -616,7 +1566,6 @@
   <w:style w:type="character" w:default="1" w:styleId="DefaultParagraphFont">
     <w:name w:val="Default Paragraph Font"/>
     <w:uiPriority w:val="1"/>
-    <w:semiHidden/>
     <w:unhideWhenUsed/>
   </w:style>
   <w:style w:type="table" w:default="1" w:styleId="TableNormal">

</xml_diff>